<commit_message>
Fix pool certificate wording and validity
</commit_message>
<xml_diff>
--- a/assets/templates/Templates/CправкаБассейн_шаблон.docx
+++ b/assets/templates/Templates/CправкаБассейн_шаблон.docx
@@ -535,7 +535,7 @@
           <w:sz w:val="24"/>
           <w:szCs w:val="24"/>
         </w:rPr>
-        <w:t>Допущен(а) по состоянию здоровья к оздоровительному плаванию в бассейне по группе А и занятиям в тренажерном зале.</w:t>
+        <w:t>[PoolAdmission] по состоянию здоровья к оздоровительному плаванию в бассейне по группе А и занятиям в тренажерном зале.</w:t>
       </w:r>
     </w:p>
     <w:p>
@@ -587,7 +587,7 @@
           <w:sz w:val="24"/>
           <w:szCs w:val="24"/>
         </w:rPr>
-        <w:t xml:space="preserve"> нет. Практически здоров(а)</w:t>
+        <w:t xml:space="preserve"> нет. Практически [PoolHealthy]</w:t>
       </w:r>
       <w:r>
         <w:rPr>
@@ -611,23 +611,23 @@
           <w:sz w:val="24"/>
           <w:szCs w:val="24"/>
         </w:rPr>
-        <w:t>Сибирцев В</w:t>
-      </w:r>
-      <w:r>
-        <w:rPr>
-          <w:rFonts w:ascii="Times New Roman" w:hAnsi="Times New Roman" w:cs="Times New Roman"/>
-          <w:sz w:val="24"/>
-          <w:szCs w:val="24"/>
-        </w:rPr>
-        <w:t>.</w:t>
-      </w:r>
-      <w:r>
-        <w:rPr>
-          <w:rFonts w:ascii="Times New Roman" w:hAnsi="Times New Roman" w:cs="Times New Roman"/>
-          <w:sz w:val="24"/>
-          <w:szCs w:val="24"/>
-        </w:rPr>
-        <w:t>А</w:t>
+        <w:t>[Doctor]</w:t>
+      </w:r>
+      <w:r>
+        <w:rPr>
+          <w:rFonts w:ascii="Times New Roman" w:hAnsi="Times New Roman" w:cs="Times New Roman"/>
+          <w:sz w:val="24"/>
+          <w:szCs w:val="24"/>
+        </w:rPr>
+        <w:t/>
+      </w:r>
+      <w:r>
+        <w:rPr>
+          <w:rFonts w:ascii="Times New Roman" w:hAnsi="Times New Roman" w:cs="Times New Roman"/>
+          <w:sz w:val="24"/>
+          <w:szCs w:val="24"/>
+        </w:rPr>
+        <w:t/>
       </w:r>
     </w:p>
     <w:p>
@@ -661,23 +661,23 @@
           <w:sz w:val="24"/>
           <w:szCs w:val="24"/>
         </w:rPr>
-        <w:t>п</w:t>
-      </w:r>
-      <w:r>
-        <w:rPr>
-          <w:rFonts w:ascii="Times New Roman" w:hAnsi="Times New Roman" w:cs="Times New Roman"/>
-          <w:sz w:val="24"/>
-          <w:szCs w:val="24"/>
-        </w:rPr>
-        <w:t>рактически</w:t>
-      </w:r>
-      <w:r>
-        <w:rPr>
-          <w:rFonts w:ascii="Times New Roman" w:hAnsi="Times New Roman" w:cs="Times New Roman"/>
-          <w:sz w:val="24"/>
-          <w:szCs w:val="24"/>
-        </w:rPr>
-        <w:t xml:space="preserve"> Здоро</w:t>
+        <w:t>практически [PoolHealthy]</w:t>
+      </w:r>
+      <w:r>
+        <w:rPr>
+          <w:rFonts w:ascii="Times New Roman" w:hAnsi="Times New Roman" w:cs="Times New Roman"/>
+          <w:sz w:val="24"/>
+          <w:szCs w:val="24"/>
+        </w:rPr>
+        <w:t/>
+      </w:r>
+      <w:r>
+        <w:rPr>
+          <w:rFonts w:ascii="Times New Roman" w:hAnsi="Times New Roman" w:cs="Times New Roman"/>
+          <w:sz w:val="24"/>
+          <w:szCs w:val="24"/>
+        </w:rPr>
+        <w:t xml:space="preserve"/>
       </w:r>
       <w:proofErr w:type="gramStart"/>
       <w:r>
@@ -686,15 +686,15 @@
           <w:sz w:val="24"/>
           <w:szCs w:val="24"/>
         </w:rPr>
-        <w:t>в</w:t>
-      </w:r>
-      <w:r>
-        <w:rPr>
-          <w:rFonts w:ascii="Times New Roman" w:hAnsi="Times New Roman" w:cs="Times New Roman"/>
-          <w:sz w:val="24"/>
-          <w:szCs w:val="24"/>
-        </w:rPr>
-        <w:t>(</w:t>
+        <w:t/>
+      </w:r>
+      <w:r>
+        <w:rPr>
+          <w:rFonts w:ascii="Times New Roman" w:hAnsi="Times New Roman" w:cs="Times New Roman"/>
+          <w:sz w:val="24"/>
+          <w:szCs w:val="24"/>
+        </w:rPr>
+        <w:t/>
       </w:r>
       <w:proofErr w:type="gramEnd"/>
       <w:r>
@@ -703,7 +703,7 @@
           <w:sz w:val="24"/>
           <w:szCs w:val="24"/>
         </w:rPr>
-        <w:t>а)</w:t>
+        <w:t/>
       </w:r>
       <w:r>
         <w:rPr>
@@ -735,49 +735,49 @@
           <w:sz w:val="24"/>
           <w:szCs w:val="24"/>
         </w:rPr>
-        <w:t>Сибирцев В</w:t>
-      </w:r>
-      <w:r>
-        <w:rPr>
-          <w:rFonts w:ascii="Times New Roman" w:hAnsi="Times New Roman" w:cs="Times New Roman"/>
-          <w:sz w:val="24"/>
-          <w:szCs w:val="24"/>
-        </w:rPr>
-        <w:t>.</w:t>
-      </w:r>
-      <w:r>
-        <w:rPr>
-          <w:rFonts w:ascii="Times New Roman" w:hAnsi="Times New Roman" w:cs="Times New Roman"/>
-          <w:sz w:val="24"/>
-          <w:szCs w:val="24"/>
-        </w:rPr>
-        <w:t>А</w:t>
-      </w:r>
-    </w:p>
-    <w:p>
-      <w:pPr>
-        <w:spacing w:line="480" w:lineRule="auto"/>
-        <w:rPr>
-          <w:rFonts w:ascii="Times New Roman" w:hAnsi="Times New Roman" w:cs="Times New Roman"/>
-          <w:sz w:val="24"/>
-          <w:szCs w:val="24"/>
-        </w:rPr>
-      </w:pPr>
-      <w:r>
-        <w:rPr>
-          <w:rFonts w:ascii="Times New Roman" w:hAnsi="Times New Roman" w:cs="Times New Roman"/>
-          <w:sz w:val="24"/>
-          <w:szCs w:val="24"/>
-        </w:rPr>
-        <w:t xml:space="preserve">Справка действительна </w:t>
-      </w:r>
-      <w:r>
-        <w:rPr>
-          <w:rFonts w:ascii="Times New Roman" w:hAnsi="Times New Roman" w:cs="Times New Roman"/>
-          <w:sz w:val="24"/>
-          <w:szCs w:val="24"/>
-        </w:rPr>
-        <w:t xml:space="preserve">6 месяцев.      </w:t>
+        <w:t>[Doctor]</w:t>
+      </w:r>
+      <w:r>
+        <w:rPr>
+          <w:rFonts w:ascii="Times New Roman" w:hAnsi="Times New Roman" w:cs="Times New Roman"/>
+          <w:sz w:val="24"/>
+          <w:szCs w:val="24"/>
+        </w:rPr>
+        <w:t/>
+      </w:r>
+      <w:r>
+        <w:rPr>
+          <w:rFonts w:ascii="Times New Roman" w:hAnsi="Times New Roman" w:cs="Times New Roman"/>
+          <w:sz w:val="24"/>
+          <w:szCs w:val="24"/>
+        </w:rPr>
+        <w:t/>
+      </w:r>
+    </w:p>
+    <w:p>
+      <w:pPr>
+        <w:spacing w:line="480" w:lineRule="auto"/>
+        <w:rPr>
+          <w:rFonts w:ascii="Times New Roman" w:hAnsi="Times New Roman" w:cs="Times New Roman"/>
+          <w:sz w:val="24"/>
+          <w:szCs w:val="24"/>
+        </w:rPr>
+      </w:pPr>
+      <w:r>
+        <w:rPr>
+          <w:rFonts w:ascii="Times New Roman" w:hAnsi="Times New Roman" w:cs="Times New Roman"/>
+          <w:sz w:val="24"/>
+          <w:szCs w:val="24"/>
+        </w:rPr>
+        <w:t xml:space="preserve">Справка действительна до [PoolValidUntil] Врач __________________ [Doctor]</w:t>
+      </w:r>
+      <w:r>
+        <w:rPr>
+          <w:rFonts w:ascii="Times New Roman" w:hAnsi="Times New Roman" w:cs="Times New Roman"/>
+          <w:sz w:val="24"/>
+          <w:szCs w:val="24"/>
+        </w:rPr>
+        <w:t xml:space="preserve">      </w:t>
       </w:r>
     </w:p>
     <w:p>

</xml_diff>

<commit_message>
Sign the pool certificate line by line
The pool certificate template repeated the same [Doctor] marker on the
dermatologist line, the therapist line and the closing "Врач" line, so
every signature printed the chairman. Give each line its own marker and
fill it from the matching exam, falling back to the signing doctor when
that exam is missing.

Co-Authored-By: Claude Opus 5 <noreply@anthropic.com>
</commit_message>
<xml_diff>
--- a/assets/templates/Templates/CправкаБассейн_шаблон.docx
+++ b/assets/templates/Templates/CправкаБассейн_шаблон.docx
@@ -611,7 +611,7 @@
           <w:sz w:val="24"/>
           <w:szCs w:val="24"/>
         </w:rPr>
-        <w:t>[Doctor]</w:t>
+        <w:t>[PoolDermatologistDoctor]</w:t>
       </w:r>
       <w:r>
         <w:rPr>
@@ -735,7 +735,7 @@
           <w:sz w:val="24"/>
           <w:szCs w:val="24"/>
         </w:rPr>
-        <w:t>[Doctor]</w:t>
+        <w:t>[PoolTherapistDoctor]</w:t>
       </w:r>
       <w:r>
         <w:rPr>
@@ -769,7 +769,7 @@
           <w:sz w:val="24"/>
           <w:szCs w:val="24"/>
         </w:rPr>
-        <w:t xml:space="preserve">Справка действительна до [PoolValidUntil] Врач __________________ [Doctor]</w:t>
+        <w:t xml:space="preserve">Справка действительна до [PoolValidUntil] Врач __________________ [PoolIssuerDoctor]</w:t>
       </w:r>
       <w:r>
         <w:rPr>

</xml_diff>